<commit_message>
Did User Testing 2
</commit_message>
<xml_diff>
--- a/docs/User Testing/List of Tasks Users must complete.docx
+++ b/docs/User Testing/List of Tasks Users must complete.docx
@@ -29,12 +29,12 @@
     </w:p>
     <w:p>
       <w:r>
-        <w:t>Save a weekly task as a draft – You are halfway through your second weekly task. Find a way to write a little bit of a reflection and save the task as a draft</w:t>
+        <w:t>Change your archetype – You feel as through your archetype no longer fits your redo your quiz and change your archetype</w:t>
       </w:r>
     </w:p>
     <w:p>
       <w:r>
-        <w:t>Change your archetype – You feel as through your archetype no longer fits your redo your quiz and change your archetype</w:t>
+        <w:t>View your quest – You want to know what your quest is about, find a way to view it.</w:t>
       </w:r>
     </w:p>
     <w:p>
@@ -44,7 +44,35 @@
     </w:p>
     <w:p>
       <w:r>
-        <w:t>Log out of your account – You want to see if you are able to relog into your account. Find a way to log out of your account</w:t>
+        <w:t xml:space="preserve">Write a challenge – Find a way to write a challenge for yourself based on the quest </w:t>
+      </w:r>
+      <w:proofErr w:type="spellStart"/>
+      <w:proofErr w:type="gramStart"/>
+      <w:r>
+        <w:t>your</w:t>
+      </w:r>
+      <w:proofErr w:type="spellEnd"/>
+      <w:proofErr w:type="gramEnd"/>
+      <w:r>
+        <w:t xml:space="preserve"> were assigned.</w:t>
+      </w:r>
+    </w:p>
+    <w:p>
+      <w:r>
+        <w:t>Edit a weekly task – You want to change your reflection for your weekly task. Find a way to change your reflection.</w:t>
+      </w:r>
+    </w:p>
+    <w:p>
+      <w:r>
+        <w:t xml:space="preserve">Log out of your account – You want to see if you </w:t>
+      </w:r>
+      <w:proofErr w:type="gramStart"/>
+      <w:r>
+        <w:t>are able to</w:t>
+      </w:r>
+      <w:proofErr w:type="gramEnd"/>
+      <w:r>
+        <w:t xml:space="preserve"> relog into your account. Find a way to log out of your account</w:t>
       </w:r>
     </w:p>
     <w:p>

</xml_diff>